<commit_message>
docs: bump SRS to v1.3 — dashboard/calendar redesign, timezone engine, global timer & streak, SEO module
</commit_message>
<xml_diff>
--- a/docs/Study_Tracker_SRS.docx
+++ b/docs/Study_Tracker_SRS.docx
@@ -57,7 +57,7 @@
         <w:pStyle w:val="BodyText"/>
       </w:pPr>
       <w:r>
-        <w:t xml:space="preserve">Version 1.1</w:t>
+        <w:t xml:space="preserve">Version 1.3</w:t>
       </w:r>
     </w:p>
     <w:p>
@@ -65,7 +65,7 @@
         <w:pStyle w:val="BodyText"/>
       </w:pPr>
       <w:r>
-        <w:t xml:space="preserve">4 September 2026</w:t>
+        <w:t xml:space="preserve">6 September 2026</w:t>
       </w:r>
     </w:p>
     <w:p>
@@ -253,7 +253,7 @@
               <w:pStyle w:val="Compact"/>
             </w:pPr>
             <w:r>
-              <w:t xml:space="preserve">1.1</w:t>
+              <w:t xml:space="preserve">1.3</w:t>
             </w:r>
           </w:p>
         </w:tc>
@@ -349,7 +349,7 @@
               <w:pStyle w:val="Compact"/>
             </w:pPr>
             <w:r>
-              <w:t xml:space="preserve">4 September 2026</w:t>
+              <w:t xml:space="preserve">6 September 2026</w:t>
             </w:r>
           </w:p>
         </w:tc>
@@ -653,6 +653,125 @@
           </w:p>
         </w:tc>
       </w:tr>
+      <w:tr>
+        <w:tc>
+          <w:tcPr/>
+          <w:p>
+            <w:pPr>
+              <w:pStyle w:val="Compact"/>
+            </w:pPr>
+            <w:r>
+              <w:t xml:space="preserve">1.2</w:t>
+            </w:r>
+          </w:p>
+        </w:tc>
+        <w:tc>
+          <w:tcPr/>
+          <w:p>
+            <w:pPr>
+              <w:pStyle w:val="Compact"/>
+            </w:pPr>
+            <w:r>
+              <w:t xml:space="preserve">4 September 2026</w:t>
+            </w:r>
+          </w:p>
+        </w:tc>
+        <w:tc>
+          <w:tcPr/>
+          <w:p>
+            <w:pPr>
+              <w:pStyle w:val="Compact"/>
+            </w:pPr>
+            <w:r>
+              <w:t xml:space="preserve">Night-shrine login redesign with interactive scene (stars/snow/embers/parallax/glass-sheen), viewport scale-lock on mobile, settings slide-in drawer, phone card overflow fix (subject cards stack vertically ≤480px), null-guard hardening across 14 CRUD chains, SW cache query-string fallback, JSON-LD WebSite schema, deleted unused legacy files.</w:t>
+            </w:r>
+          </w:p>
+        </w:tc>
+        <w:tc>
+          <w:tcPr/>
+          <w:p>
+            <w:pPr>
+              <w:pStyle w:val="Compact"/>
+            </w:pPr>
+            <w:r>
+              <w:t xml:space="preserve">Kanishk</w:t>
+            </w:r>
+          </w:p>
+        </w:tc>
+      </w:tr>
+      <w:tr>
+        <w:tc>
+          <w:tcPr/>
+          <w:p>
+            <w:pPr>
+              <w:pStyle w:val="Compact"/>
+            </w:pPr>
+            <w:r>
+              <w:t xml:space="preserve">1.3</w:t>
+            </w:r>
+          </w:p>
+        </w:tc>
+        <w:tc>
+          <w:tcPr/>
+          <w:p>
+            <w:pPr>
+              <w:pStyle w:val="Compact"/>
+            </w:pPr>
+            <w:r>
+              <w:t xml:space="preserve">6 September 2026</w:t>
+            </w:r>
+          </w:p>
+        </w:tc>
+        <w:tc>
+          <w:tcPr/>
+          <w:p>
+            <w:pPr>
+              <w:pStyle w:val="Compact"/>
+            </w:pPr>
+            <w:r>
+              <w:t xml:space="preserve">Ultra-dark dashboard port from reference mockup (css/ultra-dark.css): scorecard hero with stat pills, quick-action tiles, subject cards, priority/deadlines/revision panels, streak widget; contribution-calendar redesign as a 12-month strip (level thresholds 30/60/120 min, today ring/glow, Previous/Next-only navigation, instant scroll-restore fix); country/timezone engine (24 presets, week-start setting, zone-aware</w:t>
+            </w:r>
+            <w:r>
+              <w:t xml:space="preserve"> </w:t>
+            </w:r>
+            <w:r>
+              <w:t xml:space="preserve">“today”</w:t>
+            </w:r>
+            <w:r>
+              <w:t xml:space="preserve"> </w:t>
+            </w:r>
+            <w:r>
+              <w:t xml:space="preserve">everywhere); session-level global study timer with live calendar glow; visibility/SEO pass (SoftwareApplication + Article/Breadcrumb/FAQPage JSON-LD,</w:t>
+            </w:r>
+            <w:r>
+              <w:t xml:space="preserve"> </w:t>
+            </w:r>
+            <w:r>
+              <w:rPr>
+                <w:rStyle w:val="VerbatimChar"/>
+              </w:rPr>
+              <w:t xml:space="preserve">&lt;noscript&gt;</w:t>
+            </w:r>
+            <w:r>
+              <w:t xml:space="preserve"> </w:t>
+            </w:r>
+            <w:r>
+              <w:t xml:space="preserve">fallback, cross-linked guide pages, share button, retargeted title). Added FR-14.5/14.6, FR-5.4–5.7, modules 4.17–4.18; extended data model (settings, global-timer key) and NFR-18.</w:t>
+            </w:r>
+          </w:p>
+        </w:tc>
+        <w:tc>
+          <w:tcPr/>
+          <w:p>
+            <w:pPr>
+              <w:pStyle w:val="Compact"/>
+            </w:pPr>
+            <w:r>
+              <w:t xml:space="preserve">Kanishk</w:t>
+            </w:r>
+          </w:p>
+        </w:tc>
+      </w:tr>
     </w:tbl>
     <w:p>
       <w:pPr>
@@ -2012,6 +2131,56 @@
               <w:pStyle w:val="Compact"/>
             </w:pPr>
             <w:r>
+              <w:t xml:space="preserve">4.17 Country &amp; Timezone Awareness</w:t>
+            </w:r>
+          </w:p>
+        </w:tc>
+        <w:tc>
+          <w:tcPr/>
+          <w:p>
+            <w:pPr>
+              <w:pStyle w:val="Compact"/>
+              <w:jc w:val="right"/>
+            </w:pPr>
+            <w:r>
+              <w:t xml:space="preserve">14</w:t>
+            </w:r>
+          </w:p>
+        </w:tc>
+      </w:tr>
+      <w:tr>
+        <w:tc>
+          <w:tcPr/>
+          <w:p>
+            <w:pPr>
+              <w:pStyle w:val="Compact"/>
+            </w:pPr>
+            <w:r>
+              <w:t xml:space="preserve">4.18 Global Study Timer &amp; Streak Widget</w:t>
+            </w:r>
+          </w:p>
+        </w:tc>
+        <w:tc>
+          <w:tcPr/>
+          <w:p>
+            <w:pPr>
+              <w:pStyle w:val="Compact"/>
+              <w:jc w:val="right"/>
+            </w:pPr>
+            <w:r>
+              <w:t xml:space="preserve">14</w:t>
+            </w:r>
+          </w:p>
+        </w:tc>
+      </w:tr>
+      <w:tr>
+        <w:tc>
+          <w:tcPr/>
+          <w:p>
+            <w:pPr>
+              <w:pStyle w:val="Compact"/>
+            </w:pPr>
+            <w:r>
               <w:rPr>
                 <w:b/>
                 <w:bCs/>
@@ -3102,6 +3271,169 @@
       </w:r>
       <w:r>
         <w:t xml:space="preserve">light/dark theme.</w:t>
+      </w:r>
+    </w:p>
+    <w:p>
+      <w:pPr>
+        <w:numPr>
+          <w:ilvl w:val="0"/>
+          <w:numId w:val="1003"/>
+        </w:numPr>
+      </w:pPr>
+      <w:r>
+        <w:t xml:space="preserve">Present a single-page</w:t>
+      </w:r>
+      <w:r>
+        <w:t xml:space="preserve"> </w:t>
+      </w:r>
+      <w:r>
+        <w:t xml:space="preserve">“command centre”</w:t>
+      </w:r>
+      <w:r>
+        <w:t xml:space="preserve"> </w:t>
+      </w:r>
+      <w:r>
+        <w:t xml:space="preserve">dashboard that combines a progress</w:t>
+      </w:r>
+      <w:r>
+        <w:t xml:space="preserve"> </w:t>
+      </w:r>
+      <w:r>
+        <w:t xml:space="preserve">scorecard (progress-report eyebrow, headline, three stat pills), a</w:t>
+      </w:r>
+      <w:r>
+        <w:t xml:space="preserve"> </w:t>
+      </w:r>
+      <w:r>
+        <w:t xml:space="preserve">“Today, at a glance”</w:t>
+      </w:r>
+      <w:r>
+        <w:t xml:space="preserve"> </w:t>
+      </w:r>
+      <w:r>
+        <w:t xml:space="preserve">panel, a 12-month contribution-calendar strip, quick</w:t>
+      </w:r>
+      <w:r>
+        <w:t xml:space="preserve"> </w:t>
+      </w:r>
+      <w:r>
+        <w:t xml:space="preserve">action tiles, today’s priority list, per-subject progress cards, and</w:t>
+      </w:r>
+      <w:r>
+        <w:t xml:space="preserve"> </w:t>
+      </w:r>
+      <w:r>
+        <w:t xml:space="preserve">deadlines / needs-revision panels — rebuilt against a reference ultra-dark</w:t>
+      </w:r>
+      <w:r>
+        <w:t xml:space="preserve"> </w:t>
+      </w:r>
+      <w:r>
+        <w:t xml:space="preserve">mockup (css/ultra-dark.css).</w:t>
+      </w:r>
+    </w:p>
+    <w:p>
+      <w:pPr>
+        <w:numPr>
+          <w:ilvl w:val="0"/>
+          <w:numId w:val="1003"/>
+        </w:numPr>
+      </w:pPr>
+      <w:r>
+        <w:t xml:space="preserve">Run a session-level global study timer that is independent of any single</w:t>
+      </w:r>
+      <w:r>
+        <w:t xml:space="preserve"> </w:t>
+      </w:r>
+      <w:r>
+        <w:t xml:space="preserve">lecture, with a live counter on the dashboard; its minutes also drive the</w:t>
+      </w:r>
+      <w:r>
+        <w:t xml:space="preserve"> </w:t>
+      </w:r>
+      <w:r>
+        <w:t xml:space="preserve">calendar strip’s intensity for the current day while running.</w:t>
+      </w:r>
+    </w:p>
+    <w:p>
+      <w:pPr>
+        <w:numPr>
+          <w:ilvl w:val="0"/>
+          <w:numId w:val="1003"/>
+        </w:numPr>
+      </w:pPr>
+      <w:r>
+        <w:t xml:space="preserve">Keep a visible study-streak widget (consecutive study days) on the dashboard.</w:t>
+      </w:r>
+    </w:p>
+    <w:p>
+      <w:pPr>
+        <w:numPr>
+          <w:ilvl w:val="0"/>
+          <w:numId w:val="1003"/>
+        </w:numPr>
+      </w:pPr>
+      <w:r>
+        <w:t xml:space="preserve">Operate with timezone awareness:</w:t>
+      </w:r>
+      <w:r>
+        <w:t xml:space="preserve"> </w:t>
+      </w:r>
+      <w:r>
+        <w:t xml:space="preserve">“today”</w:t>
+      </w:r>
+      <w:r>
+        <w:t xml:space="preserve"> </w:t>
+      </w:r>
+      <w:r>
+        <w:t xml:space="preserve">and the first day of the week are</w:t>
+      </w:r>
+      <w:r>
+        <w:t xml:space="preserve"> </w:t>
+      </w:r>
+      <w:r>
+        <w:t xml:space="preserve">computed from a user-selected country/timezone (24 presets or a custom</w:t>
+      </w:r>
+      <w:r>
+        <w:t xml:space="preserve"> </w:t>
+      </w:r>
+      <w:r>
+        <w:t xml:space="preserve">zone) rather than only the device clock, and every date-dependent view</w:t>
+      </w:r>
+      <w:r>
+        <w:t xml:space="preserve"> </w:t>
+      </w:r>
+      <w:r>
+        <w:t xml:space="preserve">(calendar strip, streaks, daily planner, habits, exam pacing, daily logs,</w:t>
+      </w:r>
+      <w:r>
+        <w:t xml:space="preserve"> </w:t>
+      </w:r>
+      <w:r>
+        <w:t xml:space="preserve">demo-data seeding) follows the selected zone consistently.</w:t>
+      </w:r>
+    </w:p>
+    <w:p>
+      <w:pPr>
+        <w:numPr>
+          <w:ilvl w:val="0"/>
+          <w:numId w:val="1003"/>
+        </w:numPr>
+      </w:pPr>
+      <w:r>
+        <w:t xml:space="preserve">Share or copy a link to the app directly from the dashboard via a share</w:t>
+      </w:r>
+      <w:r>
+        <w:t xml:space="preserve"> </w:t>
+      </w:r>
+      <w:r>
+        <w:t xml:space="preserve">action that falls back from the native Web Share API to a copy-to-clipboard</w:t>
+      </w:r>
+      <w:r>
+        <w:t xml:space="preserve"> </w:t>
+      </w:r>
+      <w:r>
+        <w:t xml:space="preserve">toast.</w:t>
       </w:r>
     </w:p>
     <w:p>
@@ -3784,6 +4116,29 @@
         </w:numPr>
       </w:pPr>
       <w:r>
+        <w:t xml:space="preserve">IR-5a: Settings shall be presented in a slide-in drawer from the right</w:t>
+      </w:r>
+      <w:r>
+        <w:t xml:space="preserve"> </w:t>
+      </w:r>
+      <w:r>
+        <w:t xml:space="preserve">edge (not a centered modal), overlaying the current view with a</w:t>
+      </w:r>
+      <w:r>
+        <w:t xml:space="preserve"> </w:t>
+      </w:r>
+      <w:r>
+        <w:t xml:space="preserve">backdrop.</w:t>
+      </w:r>
+    </w:p>
+    <w:p>
+      <w:pPr>
+        <w:numPr>
+          <w:ilvl w:val="0"/>
+          <w:numId w:val="1007"/>
+        </w:numPr>
+      </w:pPr>
+      <w:r>
         <w:t xml:space="preserve">IR-6: The interface shall meet baseline accessibility behaviour:</w:t>
       </w:r>
       <w:r>
@@ -3791,6 +4146,193 @@
       </w:r>
       <w:r>
         <w:t xml:space="preserve">visible focus rings and a reduced-motion mode (see css/a11y.css).</w:t>
+      </w:r>
+    </w:p>
+    <w:p>
+      <w:pPr>
+        <w:numPr>
+          <w:ilvl w:val="0"/>
+          <w:numId w:val="1007"/>
+        </w:numPr>
+      </w:pPr>
+      <w:r>
+        <w:t xml:space="preserve">IR-7: The app head shall carry JSON-LD structured data (WebSite +</w:t>
+      </w:r>
+      <w:r>
+        <w:t xml:space="preserve"> </w:t>
+      </w:r>
+      <w:r>
+        <w:t xml:space="preserve">SoftwareApplication); the guide pages shall carry Article + BreadcrumbList</w:t>
+      </w:r>
+      <w:r>
+        <w:t xml:space="preserve"> </w:t>
+      </w:r>
+      <w:r>
+        <w:t xml:space="preserve">schema (the</w:t>
+      </w:r>
+      <w:r>
+        <w:t xml:space="preserve"> </w:t>
+      </w:r>
+      <w:r>
+        <w:t xml:space="preserve">“why”</w:t>
+      </w:r>
+      <w:r>
+        <w:t xml:space="preserve"> </w:t>
+      </w:r>
+      <w:r>
+        <w:t xml:space="preserve">page additionally FAQPage and SoftwareApplication); a</w:t>
+      </w:r>
+      <w:r>
+        <w:t xml:space="preserve"> </w:t>
+      </w:r>
+      <w:r>
+        <w:rPr>
+          <w:rStyle w:val="VerbatimChar"/>
+        </w:rPr>
+        <w:t xml:space="preserve">&lt;noscript&gt;</w:t>
+      </w:r>
+      <w:r>
+        <w:t xml:space="preserve"> </w:t>
+      </w:r>
+      <w:r>
+        <w:t xml:space="preserve">summary block and visible footer/guide links shall ensure</w:t>
+      </w:r>
+      <w:r>
+        <w:t xml:space="preserve"> </w:t>
+      </w:r>
+      <w:r>
+        <w:t xml:space="preserve">crawlers can discover and reach the guide pages from the homepage.</w:t>
+      </w:r>
+    </w:p>
+    <w:p>
+      <w:pPr>
+        <w:numPr>
+          <w:ilvl w:val="0"/>
+          <w:numId w:val="1007"/>
+        </w:numPr>
+      </w:pPr>
+      <w:r>
+        <w:t xml:space="preserve">IR-8: The dashboard shall expose a share action that uses the native Web</w:t>
+      </w:r>
+      <w:r>
+        <w:t xml:space="preserve"> </w:t>
+      </w:r>
+      <w:r>
+        <w:t xml:space="preserve">Share API when available and otherwise copies the app URL to the clipboard</w:t>
+      </w:r>
+      <w:r>
+        <w:t xml:space="preserve"> </w:t>
+      </w:r>
+      <w:r>
+        <w:t xml:space="preserve">with a confirmation toast.</w:t>
+      </w:r>
+    </w:p>
+    <w:p>
+      <w:pPr>
+        <w:numPr>
+          <w:ilvl w:val="0"/>
+          <w:numId w:val="1007"/>
+        </w:numPr>
+      </w:pPr>
+      <w:r>
+        <w:t xml:space="preserve">IR-9: The dashboard shall present the ultra-dark</w:t>
+      </w:r>
+      <w:r>
+        <w:t xml:space="preserve"> </w:t>
+      </w:r>
+      <w:r>
+        <w:t xml:space="preserve">“command centre”</w:t>
+      </w:r>
+      <w:r>
+        <w:t xml:space="preserve"> </w:t>
+      </w:r>
+      <w:r>
+        <w:t xml:space="preserve">layout:</w:t>
+      </w:r>
+      <w:r>
+        <w:t xml:space="preserve"> </w:t>
+      </w:r>
+      <w:r>
+        <w:t xml:space="preserve">progress scorecard, hero actions row (</w:t>
+      </w:r>
+      <w:r>
+        <w:t xml:space="preserve">“Today, at a glance”</w:t>
+      </w:r>
+      <w:r>
+        <w:t xml:space="preserve"> </w:t>
+      </w:r>
+      <w:r>
+        <w:t xml:space="preserve">+ progress /</w:t>
+      </w:r>
+      <w:r>
+        <w:t xml:space="preserve"> </w:t>
+      </w:r>
+      <w:r>
+        <w:t xml:space="preserve">backup / restore / share / settings), a 12-month contribution-calendar</w:t>
+      </w:r>
+      <w:r>
+        <w:t xml:space="preserve"> </w:t>
+      </w:r>
+      <w:r>
+        <w:t xml:space="preserve">strip with weekday headers and a legend, quick-action tiles, priority list,</w:t>
+      </w:r>
+      <w:r>
+        <w:t xml:space="preserve"> </w:t>
+      </w:r>
+      <w:r>
+        <w:t xml:space="preserve">subject cards, and deadlines/revision panels.</w:t>
+      </w:r>
+    </w:p>
+    <w:p>
+      <w:pPr>
+        <w:numPr>
+          <w:ilvl w:val="0"/>
+          <w:numId w:val="1007"/>
+        </w:numPr>
+      </w:pPr>
+      <w:r>
+        <w:t xml:space="preserve">IR-10: The calendar strip shall render each month as a 7-column week grid</w:t>
+      </w:r>
+      <w:r>
+        <w:t xml:space="preserve"> </w:t>
+      </w:r>
+      <w:r>
+        <w:t xml:space="preserve">(grid-auto-flow: column) with per-day intensity cells; the current day</w:t>
+      </w:r>
+      <w:r>
+        <w:t xml:space="preserve"> </w:t>
+      </w:r>
+      <w:r>
+        <w:t xml:space="preserve">shall be marked with a neon ring/glow that persists while the session</w:t>
+      </w:r>
+      <w:r>
+        <w:t xml:space="preserve"> </w:t>
+      </w:r>
+      <w:r>
+        <w:t xml:space="preserve">timer is running.</w:t>
+      </w:r>
+    </w:p>
+    <w:p>
+      <w:pPr>
+        <w:numPr>
+          <w:ilvl w:val="0"/>
+          <w:numId w:val="1007"/>
+        </w:numPr>
+      </w:pPr>
+      <w:r>
+        <w:t xml:space="preserve">IR-11: Calendar month navigation shall be Previous/Next buttons only; mouse</w:t>
+      </w:r>
+      <w:r>
+        <w:t xml:space="preserve"> </w:t>
+      </w:r>
+      <w:r>
+        <w:t xml:space="preserve">wheel and touch gestures shall not flip the month or hijack page scroll</w:t>
+      </w:r>
+      <w:r>
+        <w:t xml:space="preserve"> </w:t>
+      </w:r>
+      <w:r>
+        <w:t xml:space="preserve">(the strip uses touch-action: pan-y).</w:t>
       </w:r>
     </w:p>
     <w:p>
@@ -5542,6 +6084,146 @@
           </w:p>
         </w:tc>
       </w:tr>
+      <w:tr>
+        <w:tc>
+          <w:tcPr/>
+          <w:p>
+            <w:pPr>
+              <w:pStyle w:val="Compact"/>
+            </w:pPr>
+            <w:r>
+              <w:t xml:space="preserve">FR-5.4</w:t>
+            </w:r>
+          </w:p>
+        </w:tc>
+        <w:tc>
+          <w:tcPr/>
+          <w:p>
+            <w:pPr>
+              <w:pStyle w:val="Compact"/>
+            </w:pPr>
+            <w:r>
+              <w:t xml:space="preserve">The system shall render a 12-month contribution strip on the dashboard (12 single-month panels in one horizontally scrollable track), each panel showing a week-grid of intensity cells; future dates with planned lectures shall be flagged and open the planning popover, past dates shall open the day-tooltip on click/hover.</w:t>
+            </w:r>
+          </w:p>
+        </w:tc>
+        <w:tc>
+          <w:tcPr/>
+          <w:p>
+            <w:pPr>
+              <w:pStyle w:val="Compact"/>
+            </w:pPr>
+            <w:r>
+              <w:t xml:space="preserve">High</w:t>
+            </w:r>
+          </w:p>
+        </w:tc>
+      </w:tr>
+      <w:tr>
+        <w:tc>
+          <w:tcPr/>
+          <w:p>
+            <w:pPr>
+              <w:pStyle w:val="Compact"/>
+            </w:pPr>
+            <w:r>
+              <w:t xml:space="preserve">FR-5.5</w:t>
+            </w:r>
+          </w:p>
+        </w:tc>
+        <w:tc>
+          <w:tcPr/>
+          <w:p>
+            <w:pPr>
+              <w:pStyle w:val="Compact"/>
+            </w:pPr>
+            <w:r>
+              <w:t xml:space="preserve">A day’s intensity level shall be derived from total minutes studied (l1 ≥ 30 min, l2 ≥ 60 min, l3 ≥ 120 min, l4 beyond) and rendered as a distinct fill; the level shall also include minutes from the session-level global timer for the current day.</w:t>
+            </w:r>
+          </w:p>
+        </w:tc>
+        <w:tc>
+          <w:tcPr/>
+          <w:p>
+            <w:pPr>
+              <w:pStyle w:val="Compact"/>
+            </w:pPr>
+            <w:r>
+              <w:t xml:space="preserve">Medium</w:t>
+            </w:r>
+          </w:p>
+        </w:tc>
+      </w:tr>
+      <w:tr>
+        <w:tc>
+          <w:tcPr/>
+          <w:p>
+            <w:pPr>
+              <w:pStyle w:val="Compact"/>
+            </w:pPr>
+            <w:r>
+              <w:t xml:space="preserve">FR-5.6</w:t>
+            </w:r>
+          </w:p>
+        </w:tc>
+        <w:tc>
+          <w:tcPr/>
+          <w:p>
+            <w:pPr>
+              <w:pStyle w:val="Compact"/>
+            </w:pPr>
+            <w:r>
+              <w:t xml:space="preserve">The strip shall keep the layout aligned to the selected week start (Sunday or Monday) and must restore its horizontal scroll position instantly after every rebuild (including per-second session-timer ticks) so the visible month never shifts on its own.</w:t>
+            </w:r>
+          </w:p>
+        </w:tc>
+        <w:tc>
+          <w:tcPr/>
+          <w:p>
+            <w:pPr>
+              <w:pStyle w:val="Compact"/>
+            </w:pPr>
+            <w:r>
+              <w:t xml:space="preserve">High</w:t>
+            </w:r>
+          </w:p>
+        </w:tc>
+      </w:tr>
+      <w:tr>
+        <w:tc>
+          <w:tcPr/>
+          <w:p>
+            <w:pPr>
+              <w:pStyle w:val="Compact"/>
+            </w:pPr>
+            <w:r>
+              <w:t xml:space="preserve">FR-5.7</w:t>
+            </w:r>
+          </w:p>
+        </w:tc>
+        <w:tc>
+          <w:tcPr/>
+          <w:p>
+            <w:pPr>
+              <w:pStyle w:val="Compact"/>
+            </w:pPr>
+            <w:r>
+              <w:t xml:space="preserve">The strip shall be navigable only via Previous/Next buttons; wheel or touch scrolling must not change the month nor trigger the page to scroll.</w:t>
+            </w:r>
+          </w:p>
+        </w:tc>
+        <w:tc>
+          <w:tcPr/>
+          <w:p>
+            <w:pPr>
+              <w:pStyle w:val="Compact"/>
+            </w:pPr>
+            <w:r>
+              <w:t xml:space="preserve">Medium</w:t>
+            </w:r>
+          </w:p>
+        </w:tc>
+      </w:tr>
     </w:tbl>
     <w:p>
       <w:pPr>
@@ -7458,6 +8140,88 @@
           </w:p>
         </w:tc>
       </w:tr>
+      <w:tr>
+        <w:tc>
+          <w:tcPr/>
+          <w:p>
+            <w:pPr>
+              <w:pStyle w:val="Compact"/>
+            </w:pPr>
+            <w:r>
+              <w:t xml:space="preserve">FR-14.5</w:t>
+            </w:r>
+          </w:p>
+        </w:tc>
+        <w:tc>
+          <w:tcPr/>
+          <w:p>
+            <w:pPr>
+              <w:pStyle w:val="Compact"/>
+            </w:pPr>
+            <w:r>
+              <w:t xml:space="preserve">The settings drawer shall include a</w:t>
+            </w:r>
+            <w:r>
+              <w:t xml:space="preserve"> </w:t>
+            </w:r>
+            <w:r>
+              <w:t xml:space="preserve">“Country &amp; time”</w:t>
+            </w:r>
+            <w:r>
+              <w:t xml:space="preserve"> </w:t>
+            </w:r>
+            <w:r>
+              <w:t xml:space="preserve">section presenting a country selector (24 presets), a manual timezone field, and a week-start choice (Sunday/Monday), with a live preview of the selected country’s current date and time.</w:t>
+            </w:r>
+          </w:p>
+        </w:tc>
+        <w:tc>
+          <w:tcPr/>
+          <w:p>
+            <w:pPr>
+              <w:pStyle w:val="Compact"/>
+            </w:pPr>
+            <w:r>
+              <w:t xml:space="preserve">Medium</w:t>
+            </w:r>
+          </w:p>
+        </w:tc>
+      </w:tr>
+      <w:tr>
+        <w:tc>
+          <w:tcPr/>
+          <w:p>
+            <w:pPr>
+              <w:pStyle w:val="Compact"/>
+            </w:pPr>
+            <w:r>
+              <w:t xml:space="preserve">FR-14.6</w:t>
+            </w:r>
+          </w:p>
+        </w:tc>
+        <w:tc>
+          <w:tcPr/>
+          <w:p>
+            <w:pPr>
+              <w:pStyle w:val="Compact"/>
+            </w:pPr>
+            <w:r>
+              <w:t xml:space="preserve">The dashboard shall provide a share action that invokes the native Web Share API when supported and otherwise copies the app URL to the clipboard with a confirmation toast.</w:t>
+            </w:r>
+          </w:p>
+        </w:tc>
+        <w:tc>
+          <w:tcPr/>
+          <w:p>
+            <w:pPr>
+              <w:pStyle w:val="Compact"/>
+            </w:pPr>
+            <w:r>
+              <w:t xml:space="preserve">Low</w:t>
+            </w:r>
+          </w:p>
+        </w:tc>
+      </w:tr>
     </w:tbl>
     <w:p>
       <w:pPr>
@@ -7564,7 +8328,7 @@
               <w:pStyle w:val="Compact"/>
             </w:pPr>
             <w:r>
-              <w:t xml:space="preserve">The system shall present a login/checkpoint screen and shall allow the user to continue in an offline/guest mode without an account.</w:t>
+              <w:t xml:space="preserve">The system shall present a night-shrine-themed login/checkpoint screen with an interactive scene (animated stars, snow particles, embers, parallax, glass-sheen effects) and shall allow the user to continue in an offline/guest mode without an account. On mobile, the viewport scale shall be locked during the login gate to prevent pinch-zoom layout shifts.</w:t>
             </w:r>
           </w:p>
         </w:tc>
@@ -7826,7 +8590,16 @@
               <w:pStyle w:val="Compact"/>
             </w:pPr>
             <w:r>
-              <w:t xml:space="preserve">The system shall register a service worker that caches the static application shell so the app loads without a network connection.</w:t>
+              <w:t xml:space="preserve">The system shall register a service worker that caches the static application shell so the app loads without a network connection. The fetch handler shall strip query strings (e.g. </w:t>
+            </w:r>
+            <w:r>
+              <w:rPr>
+                <w:rStyle w:val="VerbatimChar"/>
+              </w:rPr>
+              <w:t xml:space="preserve">?v=56</w:t>
+            </w:r>
+            <w:r>
+              <w:t xml:space="preserve">) before matching cached URLs, ensuring offline access works regardless of cache-busting parameters.</w:t>
             </w:r>
           </w:p>
         </w:tc>
@@ -7887,7 +8660,7 @@
           <w:b/>
           <w:bCs/>
         </w:rPr>
-        <w:t xml:space="preserve">5. Data Model</w:t>
+        <w:t xml:space="preserve">4.17 Country &amp; Timezone Awareness</w:t>
       </w:r>
     </w:p>
     <w:p>
@@ -7895,25 +8668,67 @@
         <w:pStyle w:val="BodyText"/>
       </w:pPr>
       <w:r>
-        <w:t xml:space="preserve">All application data for one user is stored as a single JSON document</w:t>
-      </w:r>
-      <w:r>
-        <w:t xml:space="preserve"> </w:t>
-      </w:r>
-      <w:r>
-        <w:t xml:space="preserve">(storage key study-tracker-data, optionally suffixed with the signed-in</w:t>
-      </w:r>
-      <w:r>
-        <w:t xml:space="preserve"> </w:t>
-      </w:r>
-      <w:r>
-        <w:t xml:space="preserve">user’s ID). Its top-level shape, as produced by defaultData() and</w:t>
-      </w:r>
-      <w:r>
-        <w:t xml:space="preserve"> </w:t>
-      </w:r>
-      <w:r>
-        <w:t xml:space="preserve">maintained thereafter, is summarised below.</w:t>
+        <w:rPr>
+          <w:i/>
+          <w:iCs/>
+        </w:rPr>
+        <w:t xml:space="preserve">Implemented primarily in: js/time-tracking.js, js/settings.js</w:t>
+      </w:r>
+      <w:r>
+        <w:rPr>
+          <w:i/>
+          <w:iCs/>
+        </w:rPr>
+        <w:t xml:space="preserve"> </w:t>
+      </w:r>
+      <w:r>
+        <w:rPr>
+          <w:i/>
+          <w:iCs/>
+        </w:rPr>
+        <w:t xml:space="preserve">(settingsPopulateCountry/settingsSetTimeZone/settingsSetWeekStart/</w:t>
+      </w:r>
+      <w:r>
+        <w:rPr>
+          <w:i/>
+          <w:iCs/>
+        </w:rPr>
+        <w:t xml:space="preserve"> </w:t>
+      </w:r>
+      <w:r>
+        <w:rPr>
+          <w:i/>
+          <w:iCs/>
+        </w:rPr>
+        <w:t xml:space="preserve">updateCountryNowHint), plus zone-aware reads across js/dashboard.js,</w:t>
+      </w:r>
+      <w:r>
+        <w:rPr>
+          <w:i/>
+          <w:iCs/>
+        </w:rPr>
+        <w:t xml:space="preserve"> </w:t>
+      </w:r>
+      <w:r>
+        <w:rPr>
+          <w:i/>
+          <w:iCs/>
+        </w:rPr>
+        <w:t xml:space="preserve">js/render.js, js/calendar.js, js/exam-date.js, js/mascot.js,</w:t>
+      </w:r>
+      <w:r>
+        <w:rPr>
+          <w:i/>
+          <w:iCs/>
+        </w:rPr>
+        <w:t xml:space="preserve"> </w:t>
+      </w:r>
+      <w:r>
+        <w:rPr>
+          <w:i/>
+          <w:iCs/>
+        </w:rPr>
+        <w:t xml:space="preserve">js/storage.js, js/demo.js</w:t>
       </w:r>
     </w:p>
     <w:tbl>
@@ -7943,6 +8758,465 @@
                 <w:b/>
                 <w:bCs/>
               </w:rPr>
+              <w:t xml:space="preserve">ID</w:t>
+            </w:r>
+          </w:p>
+        </w:tc>
+        <w:tc>
+          <w:tcPr/>
+          <w:p>
+            <w:pPr>
+              <w:pStyle w:val="Compact"/>
+            </w:pPr>
+            <w:r>
+              <w:rPr>
+                <w:b/>
+                <w:bCs/>
+              </w:rPr>
+              <w:t xml:space="preserve">Requirement</w:t>
+            </w:r>
+          </w:p>
+        </w:tc>
+        <w:tc>
+          <w:tcPr/>
+          <w:p>
+            <w:pPr>
+              <w:pStyle w:val="Compact"/>
+            </w:pPr>
+            <w:r>
+              <w:rPr>
+                <w:b/>
+                <w:bCs/>
+              </w:rPr>
+              <w:t xml:space="preserve">Priority</w:t>
+            </w:r>
+          </w:p>
+        </w:tc>
+      </w:tr>
+      <w:tr>
+        <w:tc>
+          <w:tcPr/>
+          <w:p>
+            <w:pPr>
+              <w:pStyle w:val="Compact"/>
+            </w:pPr>
+            <w:r>
+              <w:t xml:space="preserve">FR-17.1</w:t>
+            </w:r>
+          </w:p>
+        </w:tc>
+        <w:tc>
+          <w:tcPr/>
+          <w:p>
+            <w:pPr>
+              <w:pStyle w:val="Compact"/>
+            </w:pPr>
+            <w:r>
+              <w:t xml:space="preserve">The system shall let the user select a country/timezone from a preset list (24 entries covering major study regions, with a Device-default option) or enter a custom timezone, persisted in settings.</w:t>
+            </w:r>
+          </w:p>
+        </w:tc>
+        <w:tc>
+          <w:tcPr/>
+          <w:p>
+            <w:pPr>
+              <w:pStyle w:val="Compact"/>
+            </w:pPr>
+            <w:r>
+              <w:t xml:space="preserve">Medium</w:t>
+            </w:r>
+          </w:p>
+        </w:tc>
+      </w:tr>
+      <w:tr>
+        <w:tc>
+          <w:tcPr/>
+          <w:p>
+            <w:pPr>
+              <w:pStyle w:val="Compact"/>
+            </w:pPr>
+            <w:r>
+              <w:t xml:space="preserve">FR-17.2</w:t>
+            </w:r>
+          </w:p>
+        </w:tc>
+        <w:tc>
+          <w:tcPr/>
+          <w:p>
+            <w:pPr>
+              <w:pStyle w:val="Compact"/>
+            </w:pPr>
+            <w:r>
+              <w:t xml:space="preserve">The system shall compute</w:t>
+            </w:r>
+            <w:r>
+              <w:t xml:space="preserve"> </w:t>
+            </w:r>
+            <w:r>
+              <w:t xml:space="preserve">“today”</w:t>
+            </w:r>
+            <w:r>
+              <w:t xml:space="preserve"> </w:t>
+            </w:r>
+            <w:r>
+              <w:t xml:space="preserve">from the selected timezone using a noon-anchored date (zoneTodayDate) so that the calendar day never flips at an unexpected boundary, independent of the device clock’s zone.</w:t>
+            </w:r>
+          </w:p>
+        </w:tc>
+        <w:tc>
+          <w:tcPr/>
+          <w:p>
+            <w:pPr>
+              <w:pStyle w:val="Compact"/>
+            </w:pPr>
+            <w:r>
+              <w:t xml:space="preserve">High</w:t>
+            </w:r>
+          </w:p>
+        </w:tc>
+      </w:tr>
+      <w:tr>
+        <w:tc>
+          <w:tcPr/>
+          <w:p>
+            <w:pPr>
+              <w:pStyle w:val="Compact"/>
+            </w:pPr>
+            <w:r>
+              <w:t xml:space="preserve">FR-17.3</w:t>
+            </w:r>
+          </w:p>
+        </w:tc>
+        <w:tc>
+          <w:tcPr/>
+          <w:p>
+            <w:pPr>
+              <w:pStyle w:val="Compact"/>
+            </w:pPr>
+            <w:r>
+              <w:t xml:space="preserve">The user shall be able to choose whether the week starts on Sunday or Monday; the calendar strip, planner date strips, and weekday headers shall follow that choice.</w:t>
+            </w:r>
+          </w:p>
+        </w:tc>
+        <w:tc>
+          <w:tcPr/>
+          <w:p>
+            <w:pPr>
+              <w:pStyle w:val="Compact"/>
+            </w:pPr>
+            <w:r>
+              <w:t xml:space="preserve">Medium</w:t>
+            </w:r>
+          </w:p>
+        </w:tc>
+      </w:tr>
+      <w:tr>
+        <w:tc>
+          <w:tcPr/>
+          <w:p>
+            <w:pPr>
+              <w:pStyle w:val="Compact"/>
+            </w:pPr>
+            <w:r>
+              <w:t xml:space="preserve">FR-17.4</w:t>
+            </w:r>
+          </w:p>
+        </w:tc>
+        <w:tc>
+          <w:tcPr/>
+          <w:p>
+            <w:pPr>
+              <w:pStyle w:val="Compact"/>
+            </w:pPr>
+            <w:r>
+              <w:t xml:space="preserve">All date-anchored behaviour shall use the selected zone consistently: dailyLog keys, calendar intensity, streak computation, planner dates and carry-over, habit entries, exam pacing counts, mascot time-of-day logic, and demo-data seeding (demo days are generated relative to the selected zone’s today).</w:t>
+            </w:r>
+          </w:p>
+        </w:tc>
+        <w:tc>
+          <w:tcPr/>
+          <w:p>
+            <w:pPr>
+              <w:pStyle w:val="Compact"/>
+            </w:pPr>
+            <w:r>
+              <w:t xml:space="preserve">High</w:t>
+            </w:r>
+          </w:p>
+        </w:tc>
+      </w:tr>
+    </w:tbl>
+    <w:p>
+      <w:pPr>
+        <w:pStyle w:val="BodyText"/>
+      </w:pPr>
+      <w:r>
+        <w:rPr>
+          <w:b/>
+          <w:bCs/>
+        </w:rPr>
+        <w:t xml:space="preserve">4.18 Global Study Timer &amp; Streak Widget</w:t>
+      </w:r>
+    </w:p>
+    <w:p>
+      <w:pPr>
+        <w:pStyle w:val="BodyText"/>
+      </w:pPr>
+      <w:r>
+        <w:rPr>
+          <w:i/>
+          <w:iCs/>
+        </w:rPr>
+        <w:t xml:space="preserve">Implemented primarily in: js/dashboard.js</w:t>
+      </w:r>
+      <w:r>
+        <w:rPr>
+          <w:i/>
+          <w:iCs/>
+        </w:rPr>
+        <w:t xml:space="preserve"> </w:t>
+      </w:r>
+      <w:r>
+        <w:rPr>
+          <w:i/>
+          <w:iCs/>
+        </w:rPr>
+        <w:t xml:space="preserve">(toggleGlobalStudyTimer/renderStreak/computeCurrentStreak/monthCalLevel)</w:t>
+      </w:r>
+    </w:p>
+    <w:tbl>
+      <w:tblPr>
+        <w:tblStyle w:val="Table"/>
+        <w:tblW w:type="pct" w:w="5000"/>
+        <w:tblLayout w:type="fixed"/>
+        <w:tblLook w:firstRow="1" w:lastRow="0" w:firstColumn="0" w:lastColumn="0" w:noHBand="0" w:noVBand="0" w:val="0020"/>
+      </w:tblPr>
+      <w:tblGrid>
+        <w:gridCol w:w="2640"/>
+        <w:gridCol w:w="2640"/>
+        <w:gridCol w:w="2640"/>
+      </w:tblGrid>
+      <w:tr>
+        <w:trPr>
+          <w:tblHeader w:val="on"/>
+        </w:trPr>
+        <w:tc>
+          <w:tcPr/>
+          <w:p>
+            <w:pPr>
+              <w:pStyle w:val="Compact"/>
+            </w:pPr>
+            <w:r>
+              <w:rPr>
+                <w:b/>
+                <w:bCs/>
+              </w:rPr>
+              <w:t xml:space="preserve">ID</w:t>
+            </w:r>
+          </w:p>
+        </w:tc>
+        <w:tc>
+          <w:tcPr/>
+          <w:p>
+            <w:pPr>
+              <w:pStyle w:val="Compact"/>
+            </w:pPr>
+            <w:r>
+              <w:rPr>
+                <w:b/>
+                <w:bCs/>
+              </w:rPr>
+              <w:t xml:space="preserve">Requirement</w:t>
+            </w:r>
+          </w:p>
+        </w:tc>
+        <w:tc>
+          <w:tcPr/>
+          <w:p>
+            <w:pPr>
+              <w:pStyle w:val="Compact"/>
+            </w:pPr>
+            <w:r>
+              <w:rPr>
+                <w:b/>
+                <w:bCs/>
+              </w:rPr>
+              <w:t xml:space="preserve">Priority</w:t>
+            </w:r>
+          </w:p>
+        </w:tc>
+      </w:tr>
+      <w:tr>
+        <w:tc>
+          <w:tcPr/>
+          <w:p>
+            <w:pPr>
+              <w:pStyle w:val="Compact"/>
+            </w:pPr>
+            <w:r>
+              <w:t xml:space="preserve">FR-18.1</w:t>
+            </w:r>
+          </w:p>
+        </w:tc>
+        <w:tc>
+          <w:tcPr/>
+          <w:p>
+            <w:pPr>
+              <w:pStyle w:val="Compact"/>
+            </w:pPr>
+            <w:r>
+              <w:t xml:space="preserve">The system shall provide a session-level study timer on the dashboard that starts and stops independently of any single lecture, displaying the running seconds live (formatCompactLive) and updating at least once per second.</w:t>
+            </w:r>
+          </w:p>
+        </w:tc>
+        <w:tc>
+          <w:tcPr/>
+          <w:p>
+            <w:pPr>
+              <w:pStyle w:val="Compact"/>
+            </w:pPr>
+            <w:r>
+              <w:t xml:space="preserve">Medium</w:t>
+            </w:r>
+          </w:p>
+        </w:tc>
+      </w:tr>
+      <w:tr>
+        <w:tc>
+          <w:tcPr/>
+          <w:p>
+            <w:pPr>
+              <w:pStyle w:val="Compact"/>
+            </w:pPr>
+            <w:r>
+              <w:t xml:space="preserve">FR-18.2</w:t>
+            </w:r>
+          </w:p>
+        </w:tc>
+        <w:tc>
+          <w:tcPr/>
+          <w:p>
+            <w:pPr>
+              <w:pStyle w:val="Compact"/>
+            </w:pPr>
+            <w:r>
+              <w:t xml:space="preserve">Running minutes from the global timer shall be persisted under a dedicated auxiliary key (study-tracker-real-study-minutes-v1) so the session survives a reload, and shall feed the calendar strip’s intensity for the current day while active (and its accumulated total thereafter).</w:t>
+            </w:r>
+          </w:p>
+        </w:tc>
+        <w:tc>
+          <w:tcPr/>
+          <w:p>
+            <w:pPr>
+              <w:pStyle w:val="Compact"/>
+            </w:pPr>
+            <w:r>
+              <w:t xml:space="preserve">Medium</w:t>
+            </w:r>
+          </w:p>
+        </w:tc>
+      </w:tr>
+      <w:tr>
+        <w:tc>
+          <w:tcPr/>
+          <w:p>
+            <w:pPr>
+              <w:pStyle w:val="Compact"/>
+            </w:pPr>
+            <w:r>
+              <w:t xml:space="preserve">FR-18.3</w:t>
+            </w:r>
+          </w:p>
+        </w:tc>
+        <w:tc>
+          <w:tcPr/>
+          <w:p>
+            <w:pPr>
+              <w:pStyle w:val="Compact"/>
+            </w:pPr>
+            <w:r>
+              <w:t xml:space="preserve">The dashboard shall display a study-streak widget derived from consecutive days with logged study (computeCurrentStreak), alongside the strip and scorecard.</w:t>
+            </w:r>
+          </w:p>
+        </w:tc>
+        <w:tc>
+          <w:tcPr/>
+          <w:p>
+            <w:pPr>
+              <w:pStyle w:val="Compact"/>
+            </w:pPr>
+            <w:r>
+              <w:t xml:space="preserve">Medium</w:t>
+            </w:r>
+          </w:p>
+        </w:tc>
+      </w:tr>
+    </w:tbl>
+    <w:p>
+      <w:pPr>
+        <w:pStyle w:val="BodyText"/>
+      </w:pPr>
+      <w:r>
+        <w:rPr>
+          <w:b/>
+          <w:bCs/>
+        </w:rPr>
+        <w:t xml:space="preserve">5. Data Model</w:t>
+      </w:r>
+    </w:p>
+    <w:p>
+      <w:pPr>
+        <w:pStyle w:val="BodyText"/>
+      </w:pPr>
+      <w:r>
+        <w:t xml:space="preserve">All application data for one user is stored as a single JSON document</w:t>
+      </w:r>
+      <w:r>
+        <w:t xml:space="preserve"> </w:t>
+      </w:r>
+      <w:r>
+        <w:t xml:space="preserve">(storage key study-tracker-data, optionally suffixed with the signed-in</w:t>
+      </w:r>
+      <w:r>
+        <w:t xml:space="preserve"> </w:t>
+      </w:r>
+      <w:r>
+        <w:t xml:space="preserve">user’s ID). Its top-level shape, as produced by defaultData() and</w:t>
+      </w:r>
+      <w:r>
+        <w:t xml:space="preserve"> </w:t>
+      </w:r>
+      <w:r>
+        <w:t xml:space="preserve">maintained thereafter, is summarised below.</w:t>
+      </w:r>
+    </w:p>
+    <w:tbl>
+      <w:tblPr>
+        <w:tblStyle w:val="Table"/>
+        <w:tblW w:type="pct" w:w="5000"/>
+        <w:tblLayout w:type="fixed"/>
+        <w:tblLook w:firstRow="1" w:lastRow="0" w:firstColumn="0" w:lastColumn="0" w:noHBand="0" w:noVBand="0" w:val="0020"/>
+      </w:tblPr>
+      <w:tblGrid>
+        <w:gridCol w:w="2640"/>
+        <w:gridCol w:w="2640"/>
+        <w:gridCol w:w="2640"/>
+      </w:tblGrid>
+      <w:tr>
+        <w:trPr>
+          <w:tblHeader w:val="on"/>
+        </w:trPr>
+        <w:tc>
+          <w:tcPr/>
+          <w:p>
+            <w:pPr>
+              <w:pStyle w:val="Compact"/>
+            </w:pPr>
+            <w:r>
+              <w:rPr>
+                <w:b/>
+                <w:bCs/>
+              </w:rPr>
               <w:t xml:space="preserve">Field</w:t>
             </w:r>
           </w:p>
@@ -8266,6 +9540,41 @@
               <w:pStyle w:val="Compact"/>
             </w:pPr>
             <w:r>
+              <w:t xml:space="preserve">settings</w:t>
+            </w:r>
+          </w:p>
+        </w:tc>
+        <w:tc>
+          <w:tcPr/>
+          <w:p>
+            <w:pPr>
+              <w:pStyle w:val="Compact"/>
+            </w:pPr>
+            <w:r>
+              <w:t xml:space="preserve">Object</w:t>
+            </w:r>
+          </w:p>
+        </w:tc>
+        <w:tc>
+          <w:tcPr/>
+          <w:p>
+            <w:pPr>
+              <w:pStyle w:val="Compact"/>
+            </w:pPr>
+            <w:r>
+              <w:t xml:space="preserve">User preferences persisted and sanitised on load (normalizeLoadedData): display name, theme, selected country/timezone, week-start preference, exam-date default, etc.</w:t>
+            </w:r>
+          </w:p>
+        </w:tc>
+      </w:tr>
+      <w:tr>
+        <w:tc>
+          <w:tcPr/>
+          <w:p>
+            <w:pPr>
+              <w:pStyle w:val="Compact"/>
+            </w:pPr>
+            <w:r>
               <w:t xml:space="preserve">updatedAt</w:t>
             </w:r>
           </w:p>
@@ -8294,6 +9603,38 @@
         </w:tc>
       </w:tr>
     </w:tbl>
+    <w:p>
+      <w:pPr>
+        <w:pStyle w:val="BodyText"/>
+      </w:pPr>
+      <w:r>
+        <w:t xml:space="preserve">A small auxiliary, localStorage-only key — study-tracker-real-study-minutes-v1</w:t>
+      </w:r>
+      <w:r>
+        <w:t xml:space="preserve"> </w:t>
+      </w:r>
+      <w:r>
+        <w:t xml:space="preserve">— records total minutes accumulated by the dashboard’s session-level global</w:t>
+      </w:r>
+      <w:r>
+        <w:t xml:space="preserve"> </w:t>
+      </w:r>
+      <w:r>
+        <w:t xml:space="preserve">study timer. It is deliberately kept separate from the main JSON document so</w:t>
+      </w:r>
+      <w:r>
+        <w:t xml:space="preserve"> </w:t>
+      </w:r>
+      <w:r>
+        <w:t xml:space="preserve">the running session (and live calendar glow) can survive a page reload; the</w:t>
+      </w:r>
+      <w:r>
+        <w:t xml:space="preserve"> </w:t>
+      </w:r>
+      <w:r>
+        <w:t xml:space="preserve">minutes are merged into the current day’s calendar intensity at render time.</w:t>
+      </w:r>
+    </w:p>
     <w:p>
       <w:pPr>
         <w:pStyle w:val="BodyText"/>
@@ -8371,6 +9712,47 @@
     </w:p>
     <w:p>
       <w:pPr>
+        <w:numPr>
+          <w:ilvl w:val="0"/>
+          <w:numId w:val="1008"/>
+        </w:numPr>
+      </w:pPr>
+      <w:r>
+        <w:t xml:space="preserve">NFR-18: While the session-level global timer runs, the dashboard</w:t>
+      </w:r>
+      <w:r>
+        <w:t xml:space="preserve"> </w:t>
+      </w:r>
+      <w:r>
+        <w:t xml:space="preserve">re-renders (calendar strip, live counters) at least once per second; each</w:t>
+      </w:r>
+      <w:r>
+        <w:t xml:space="preserve"> </w:t>
+      </w:r>
+      <w:r>
+        <w:t xml:space="preserve">rebuild must restore the strip’s horizontal scroll position instantly</w:t>
+      </w:r>
+      <w:r>
+        <w:t xml:space="preserve"> </w:t>
+      </w:r>
+      <w:r>
+        <w:t xml:space="preserve">(snapCalToMonth, no smooth glide) so repeated per-second refreshes never</w:t>
+      </w:r>
+      <w:r>
+        <w:t xml:space="preserve"> </w:t>
+      </w:r>
+      <w:r>
+        <w:t xml:space="preserve">visibly shift the month a user is viewing, and must not produce scroll-jank</w:t>
+      </w:r>
+      <w:r>
+        <w:t xml:space="preserve"> </w:t>
+      </w:r>
+      <w:r>
+        <w:t xml:space="preserve">or layout drift.</w:t>
+      </w:r>
+    </w:p>
+    <w:p>
+      <w:pPr>
         <w:pStyle w:val="FirstParagraph"/>
       </w:pPr>
       <w:r>
@@ -8631,13 +10013,42 @@
         <w:t xml:space="preserve"> </w:t>
       </w:r>
       <w:r>
-        <w:t xml:space="preserve">documented in README.md, since later files intentionally override or</w:t>
-      </w:r>
-      <w:r>
-        <w:t xml:space="preserve"> </w:t>
-      </w:r>
-      <w:r>
-        <w:t xml:space="preserve">depend on earlier ones.</w:t>
+        <w:t xml:space="preserve">documented in the project file map, since later files intentionally</w:t>
+      </w:r>
+      <w:r>
+        <w:t xml:space="preserve"> </w:t>
+      </w:r>
+      <w:r>
+        <w:t xml:space="preserve">override or depend on earlier ones.</w:t>
+      </w:r>
+    </w:p>
+    <w:p>
+      <w:pPr>
+        <w:numPr>
+          <w:ilvl w:val="0"/>
+          <w:numId w:val="1012"/>
+        </w:numPr>
+      </w:pPr>
+      <w:r>
+        <w:t xml:space="preserve">NFR-17: All CRUD chain lookups (subject → unit → lecture/test) shall</w:t>
+      </w:r>
+      <w:r>
+        <w:t xml:space="preserve"> </w:t>
+      </w:r>
+      <w:r>
+        <w:t xml:space="preserve">include null guards to prevent crashes when a parent entity has been</w:t>
+      </w:r>
+      <w:r>
+        <w:t xml:space="preserve"> </w:t>
+      </w:r>
+      <w:r>
+        <w:t xml:space="preserve">deleted (e.g. by cloud sync from another device) while a child modal</w:t>
+      </w:r>
+      <w:r>
+        <w:t xml:space="preserve"> </w:t>
+      </w:r>
+      <w:r>
+        <w:t xml:space="preserve">is open.</w:t>
       </w:r>
     </w:p>
     <w:p>
@@ -9059,6 +10470,65 @@
     <w:p>
       <w:pPr>
         <w:pStyle w:val="FirstParagraph"/>
+      </w:pPr>
+      <w:r>
+        <w:t xml:space="preserve">All three pages are cross-linked with each other and with the home app, and</w:t>
+      </w:r>
+      <w:r>
+        <w:t xml:space="preserve"> </w:t>
+      </w:r>
+      <w:r>
+        <w:t xml:space="preserve">carry JSON-LD structured data (Article + BreadcrumbList; the</w:t>
+      </w:r>
+      <w:r>
+        <w:t xml:space="preserve"> </w:t>
+      </w:r>
+      <w:r>
+        <w:t xml:space="preserve">“why”</w:t>
+      </w:r>
+      <w:r>
+        <w:t xml:space="preserve"> </w:t>
+      </w:r>
+      <w:r>
+        <w:t xml:space="preserve">page also</w:t>
+      </w:r>
+      <w:r>
+        <w:t xml:space="preserve"> </w:t>
+      </w:r>
+      <w:r>
+        <w:t xml:space="preserve">ships SoftwareApplication and FAQPage schema). The home app links to all three</w:t>
+      </w:r>
+      <w:r>
+        <w:t xml:space="preserve"> </w:t>
+      </w:r>
+      <w:r>
+        <w:t xml:space="preserve">via its</w:t>
+      </w:r>
+      <w:r>
+        <w:t xml:space="preserve"> </w:t>
+      </w:r>
+      <w:r>
+        <w:rPr>
+          <w:rStyle w:val="VerbatimChar"/>
+        </w:rPr>
+        <w:t xml:space="preserve">&lt;noscript&gt;</w:t>
+      </w:r>
+      <w:r>
+        <w:t xml:space="preserve"> </w:t>
+      </w:r>
+      <w:r>
+        <w:t xml:space="preserve">block and the login-screen guide footer to help crawlers</w:t>
+      </w:r>
+      <w:r>
+        <w:t xml:space="preserve"> </w:t>
+      </w:r>
+      <w:r>
+        <w:t xml:space="preserve">reach the full content graph from the homepage.</w:t>
+      </w:r>
+    </w:p>
+    <w:p>
+      <w:pPr>
+        <w:pStyle w:val="BodyText"/>
       </w:pPr>
       <w:r>
         <w:rPr>

</xml_diff>